<commit_message>
Finalize Unit 4 Assessment 5 submission pack
</commit_message>
<xml_diff>
--- a/unit-4/assessment-5-deep-learning-training-project/Unit 4 Assessment 5 - TQUK Observation Record - Rob Johnston.docx
+++ b/unit-4/assessment-5-deep-learning-training-project/Unit 4 Assessment 5 - TQUK Observation Record - Rob Johnston.docx
@@ -3,69 +3,39 @@
 <w:document xmlns:wpc="http://schemas.microsoft.com/office/word/2010/wordprocessingCanvas" xmlns:mo="http://schemas.microsoft.com/office/mac/office/2008/main" xmlns:mc="http://schemas.openxmlformats.org/markup-compatibility/2006" xmlns:mv="urn:schemas-microsoft-com:mac:vml" xmlns:o="urn:schemas-microsoft-com:office:office" xmlns:r="http://schemas.openxmlformats.org/officeDocument/2006/relationships" xmlns:m="http://schemas.openxmlformats.org/officeDocument/2006/math" xmlns:v="urn:schemas-microsoft-com:vml" xmlns:wp14="http://schemas.microsoft.com/office/word/2010/wordprocessingDrawing" xmlns:wp="http://schemas.openxmlformats.org/drawingml/2006/wordprocessingDrawing" xmlns:w10="urn:schemas-microsoft-com:office:word" xmlns:w="http://schemas.openxmlformats.org/wordprocessingml/2006/main" xmlns:w14="http://schemas.microsoft.com/office/word/2010/wordml" xmlns:wpg="http://schemas.microsoft.com/office/word/2010/wordprocessingGroup" xmlns:wpi="http://schemas.microsoft.com/office/word/2010/wordprocessingInk" xmlns:wne="http://schemas.microsoft.com/office/word/2006/wordml" xmlns:wps="http://schemas.microsoft.com/office/word/2010/wordprocessingShape" mc:Ignorable="w14 wp14">
   <w:body>
     <w:p>
+      <w:r>
+        <w:rPr>
+          <w:rFonts w:ascii="Arial" w:hAnsi="Arial"/>
+          <w:sz w:val="20"/>
+        </w:rPr>
+        <w:t>Unit 4 Lesson 5 Deep Learning Training Project Observation Record</w:t>
+      </w:r>
+    </w:p>
+    <w:p>
       <w:pPr>
-        <w:spacing w:after="120"/>
+        <w:jc w:val="left"/>
       </w:pPr>
       <w:r>
         <w:rPr>
           <w:rFonts w:ascii="Arial" w:hAnsi="Arial"/>
           <w:b/>
-          <w:color w:val="26802D"/>
-          <w:sz w:val="18"/>
+          <w:color w:val="00723A"/>
+          <w:sz w:val="44"/>
         </w:rPr>
-        <w:t>TQUK Observation Record</w:t>
+        <w:t>Unit 4 Lesson 5 - Deep Learning Training Project</w:t>
       </w:r>
     </w:p>
     <w:p>
-      <w:pPr>
-        <w:spacing w:after="120"/>
-      </w:pPr>
-      <w:r>
-        <w:t>Unit 4 Assessment 5 - TQUK Observation Record</w:t>
-      </w:r>
-    </w:p>
-    <w:p>
-      <w:pPr>
-        <w:spacing w:after="120"/>
-      </w:pPr>
       <w:r>
         <w:rPr>
           <w:rFonts w:ascii="Arial" w:hAnsi="Arial"/>
-          <w:b w:val="0"/>
-          <w:color w:val="464646"/>
           <w:sz w:val="20"/>
         </w:rPr>
-        <w:t>Rob Johnston | TQUK Level 3 Certificate in AI Programming with Python</w:t>
+        <w:t>TQUK Observation Record for Iris dataset training, validation-set hyperparameter tuning and inference evidence.</w:t>
       </w:r>
     </w:p>
-    <w:p>
-      <w:pPr>
-        <w:spacing w:after="120"/>
-      </w:pPr>
-      <w:r>
-        <w:t>Deep Learning Training Project</w:t>
-      </w:r>
-    </w:p>
-    <w:p>
-      <w:pPr>
-        <w:spacing w:after="120"/>
-      </w:pPr>
-      <w:r>
-        <w:t>Criteria covered: 3.1, 3.2, 3.3</w:t>
-      </w:r>
-    </w:p>
-    <w:p>
-      <w:pPr>
-        <w:spacing w:after="120"/>
-      </w:pPr>
-      <w:r>
-        <w:t>Date: 02/07/2026</w:t>
-      </w:r>
-    </w:p>
-    <w:p/>
     <w:tbl>
       <w:tblPr>
-        <w:tblStyle w:val="TableGrid"/>
         <w:tblW w:type="auto" w:w="0"/>
         <w:jc w:val="center"/>
         <w:tblLook w:firstColumn="1" w:firstRow="1" w:lastColumn="0" w:lastRow="0" w:noHBand="0" w:noVBand="1" w:val="04A0"/>
@@ -79,11 +49,25 @@
           <w:tcPr>
             <w:tcW w:type="dxa" w:w="5184"/>
             <w:vAlign w:val="center"/>
-            <w:shd w:fill="1F6B2A"/>
+            <w:shd w:fill="000000"/>
           </w:tcPr>
           <w:p>
             <w:r>
-              <w:t>Field</w:t>
+              <w:rPr>
+                <w:rFonts w:ascii="Arial" w:hAnsi="Arial"/>
+                <w:b/>
+                <w:color w:val="FFFFFF"/>
+                <w:sz w:val="19"/>
+              </w:rPr>
+            </w:r>
+            <w:r>
+              <w:rPr>
+                <w:rFonts w:ascii="Arial" w:hAnsi="Arial"/>
+                <w:b/>
+                <w:color w:val="FFFFFF"/>
+                <w:sz w:val="19"/>
+              </w:rPr>
+              <w:t>Document type</w:t>
             </w:r>
           </w:p>
         </w:tc>
@@ -91,11 +75,25 @@
           <w:tcPr>
             <w:tcW w:type="dxa" w:w="5184"/>
             <w:vAlign w:val="center"/>
-            <w:shd w:fill="1F6B2A"/>
+            <w:shd w:fill="000000"/>
           </w:tcPr>
           <w:p>
             <w:r>
-              <w:t>Entry</w:t>
+              <w:rPr>
+                <w:rFonts w:ascii="Arial" w:hAnsi="Arial"/>
+                <w:b/>
+                <w:color w:val="FFFFFF"/>
+                <w:sz w:val="19"/>
+              </w:rPr>
+            </w:r>
+            <w:r>
+              <w:rPr>
+                <w:rFonts w:ascii="Arial" w:hAnsi="Arial"/>
+                <w:b/>
+                <w:color w:val="FFFFFF"/>
+                <w:sz w:val="19"/>
+              </w:rPr>
+              <w:t>TQUK Observation Record</w:t>
             </w:r>
           </w:p>
         </w:tc>
@@ -105,11 +103,22 @@
           <w:tcPr>
             <w:tcW w:type="dxa" w:w="5184"/>
             <w:vAlign w:val="center"/>
-            <w:shd w:fill="F3FFF1"/>
+            <w:shd w:fill="EEF7EC"/>
           </w:tcPr>
           <w:p>
             <w:r>
-              <w:t>Learner name</w:t>
+              <w:rPr>
+                <w:rFonts w:ascii="Arial" w:hAnsi="Arial"/>
+                <w:sz w:val="19"/>
+              </w:rPr>
+            </w:r>
+            <w:r>
+              <w:rPr>
+                <w:rFonts w:ascii="Arial" w:hAnsi="Arial"/>
+                <w:b w:val="0"/>
+                <w:sz w:val="19"/>
+              </w:rPr>
+              <w:t>Learner</w:t>
             </w:r>
           </w:p>
         </w:tc>
@@ -117,10 +126,21 @@
           <w:tcPr>
             <w:tcW w:type="dxa" w:w="5184"/>
             <w:vAlign w:val="center"/>
-            <w:shd w:fill="F3FFF1"/>
+            <w:shd w:fill="EEF7EC"/>
           </w:tcPr>
           <w:p>
             <w:r>
+              <w:rPr>
+                <w:rFonts w:ascii="Arial" w:hAnsi="Arial"/>
+                <w:sz w:val="19"/>
+              </w:rPr>
+            </w:r>
+            <w:r>
+              <w:rPr>
+                <w:rFonts w:ascii="Arial" w:hAnsi="Arial"/>
+                <w:b w:val="0"/>
+                <w:sz w:val="19"/>
+              </w:rPr>
               <w:t>Rob Johnston</w:t>
             </w:r>
           </w:p>
@@ -131,10 +151,22 @@
           <w:tcPr>
             <w:tcW w:type="dxa" w:w="5184"/>
             <w:vAlign w:val="center"/>
+            <w:shd w:fill="EEF7EC"/>
           </w:tcPr>
           <w:p>
             <w:r>
-              <w:t>Qualification</w:t>
+              <w:rPr>
+                <w:rFonts w:ascii="Arial" w:hAnsi="Arial"/>
+                <w:sz w:val="19"/>
+              </w:rPr>
+            </w:r>
+            <w:r>
+              <w:rPr>
+                <w:rFonts w:ascii="Arial" w:hAnsi="Arial"/>
+                <w:b w:val="0"/>
+                <w:sz w:val="19"/>
+              </w:rPr>
+              <w:t>Unit</w:t>
             </w:r>
           </w:p>
         </w:tc>
@@ -142,10 +174,22 @@
           <w:tcPr>
             <w:tcW w:type="dxa" w:w="5184"/>
             <w:vAlign w:val="center"/>
+            <w:shd w:fill="EEF7EC"/>
           </w:tcPr>
           <w:p>
             <w:r>
-              <w:t>TQUK Level 3 Certificate in AI Programming with Python</w:t>
+              <w:rPr>
+                <w:rFonts w:ascii="Arial" w:hAnsi="Arial"/>
+                <w:sz w:val="19"/>
+              </w:rPr>
+            </w:r>
+            <w:r>
+              <w:rPr>
+                <w:rFonts w:ascii="Arial" w:hAnsi="Arial"/>
+                <w:b w:val="0"/>
+                <w:sz w:val="19"/>
+              </w:rPr>
+              <w:t>Unit 4 - Deep Learning</w:t>
             </w:r>
           </w:p>
         </w:tc>
@@ -155,11 +199,22 @@
           <w:tcPr>
             <w:tcW w:type="dxa" w:w="5184"/>
             <w:vAlign w:val="center"/>
-            <w:shd w:fill="F3FFF1"/>
+            <w:shd w:fill="EEF7EC"/>
           </w:tcPr>
           <w:p>
             <w:r>
-              <w:t>Unit</w:t>
+              <w:rPr>
+                <w:rFonts w:ascii="Arial" w:hAnsi="Arial"/>
+                <w:sz w:val="19"/>
+              </w:rPr>
+            </w:r>
+            <w:r>
+              <w:rPr>
+                <w:rFonts w:ascii="Arial" w:hAnsi="Arial"/>
+                <w:b w:val="0"/>
+                <w:sz w:val="19"/>
+              </w:rPr>
+              <w:t>Assessment</w:t>
             </w:r>
           </w:p>
         </w:tc>
@@ -167,11 +222,22 @@
           <w:tcPr>
             <w:tcW w:type="dxa" w:w="5184"/>
             <w:vAlign w:val="center"/>
-            <w:shd w:fill="F3FFF1"/>
+            <w:shd w:fill="EEF7EC"/>
           </w:tcPr>
           <w:p>
             <w:r>
-              <w:t>Deep Learning (D/650/0764, A/650/0763 and Y/650/0762)</w:t>
+              <w:rPr>
+                <w:rFonts w:ascii="Arial" w:hAnsi="Arial"/>
+                <w:sz w:val="19"/>
+              </w:rPr>
+            </w:r>
+            <w:r>
+              <w:rPr>
+                <w:rFonts w:ascii="Arial" w:hAnsi="Arial"/>
+                <w:b w:val="0"/>
+                <w:sz w:val="19"/>
+              </w:rPr>
+              <w:t>Lesson 5 - Deep Learning Training Project</w:t>
             </w:r>
           </w:p>
         </w:tc>
@@ -181,10 +247,22 @@
           <w:tcPr>
             <w:tcW w:type="dxa" w:w="5184"/>
             <w:vAlign w:val="center"/>
+            <w:shd w:fill="EEF7EC"/>
           </w:tcPr>
           <w:p>
             <w:r>
-              <w:t>Assessment</w:t>
+              <w:rPr>
+                <w:rFonts w:ascii="Arial" w:hAnsi="Arial"/>
+                <w:sz w:val="19"/>
+              </w:rPr>
+            </w:r>
+            <w:r>
+              <w:rPr>
+                <w:rFonts w:ascii="Arial" w:hAnsi="Arial"/>
+                <w:b w:val="0"/>
+                <w:sz w:val="19"/>
+              </w:rPr>
+              <w:t>Submission pack</w:t>
             </w:r>
           </w:p>
         </w:tc>
@@ -192,10 +270,22 @@
           <w:tcPr>
             <w:tcW w:type="dxa" w:w="5184"/>
             <w:vAlign w:val="center"/>
+            <w:shd w:fill="EEF7EC"/>
           </w:tcPr>
           <w:p>
             <w:r>
-              <w:t>Unit 4 Lesson 5 - Project</w:t>
+              <w:rPr>
+                <w:rFonts w:ascii="Arial" w:hAnsi="Arial"/>
+                <w:sz w:val="19"/>
+              </w:rPr>
+            </w:r>
+            <w:r>
+              <w:rPr>
+                <w:rFonts w:ascii="Arial" w:hAnsi="Arial"/>
+                <w:b w:val="0"/>
+                <w:sz w:val="19"/>
+              </w:rPr>
+              <w:t>Unit 4 Assessment 5 - Submission Pack - Rob Johnston.zip</w:t>
             </w:r>
           </w:p>
         </w:tc>
@@ -205,11 +295,22 @@
           <w:tcPr>
             <w:tcW w:type="dxa" w:w="5184"/>
             <w:vAlign w:val="center"/>
-            <w:shd w:fill="F3FFF1"/>
+            <w:shd w:fill="EEF7EC"/>
           </w:tcPr>
           <w:p>
             <w:r>
-              <w:t>Evidence route</w:t>
+              <w:rPr>
+                <w:rFonts w:ascii="Arial" w:hAnsi="Arial"/>
+                <w:sz w:val="19"/>
+              </w:rPr>
+            </w:r>
+            <w:r>
+              <w:rPr>
+                <w:rFonts w:ascii="Arial" w:hAnsi="Arial"/>
+                <w:b w:val="0"/>
+                <w:sz w:val="19"/>
+              </w:rPr>
+              <w:t>Evidence focus</w:t>
             </w:r>
           </w:p>
         </w:tc>
@@ -217,11 +318,22 @@
           <w:tcPr>
             <w:tcW w:type="dxa" w:w="5184"/>
             <w:vAlign w:val="center"/>
-            <w:shd w:fill="F3FFF1"/>
+            <w:shd w:fill="EEF7EC"/>
           </w:tcPr>
           <w:p>
             <w:r>
-              <w:t>SS Evidence Collection, Kaggle notebook, video walkthrough and Python source files</w:t>
+              <w:rPr>
+                <w:rFonts w:ascii="Arial" w:hAnsi="Arial"/>
+                <w:sz w:val="19"/>
+              </w:rPr>
+            </w:r>
+            <w:r>
+              <w:rPr>
+                <w:rFonts w:ascii="Arial" w:hAnsi="Arial"/>
+                <w:b w:val="0"/>
+                <w:sz w:val="19"/>
+              </w:rPr>
+              <w:t>Iris dataset training, validation tuning and inference</w:t>
             </w:r>
           </w:p>
         </w:tc>
@@ -230,7 +342,6 @@
     <w:p/>
     <w:tbl>
       <w:tblPr>
-        <w:tblStyle w:val="TableGrid"/>
         <w:tblW w:type="auto" w:w="0"/>
         <w:jc w:val="center"/>
         <w:tblLook w:firstColumn="1" w:firstRow="1" w:lastColumn="0" w:lastRow="0" w:noHBand="0" w:noVBand="1" w:val="04A0"/>
@@ -244,11 +355,25 @@
           <w:tcPr>
             <w:tcW w:type="dxa" w:w="5184"/>
             <w:vAlign w:val="center"/>
-            <w:shd w:fill="1F6B2A"/>
+            <w:shd w:fill="000000"/>
           </w:tcPr>
           <w:p>
             <w:r>
-              <w:t>Criterion</w:t>
+              <w:rPr>
+                <w:rFonts w:ascii="Arial" w:hAnsi="Arial"/>
+                <w:b/>
+                <w:color w:val="FFFFFF"/>
+                <w:sz w:val="19"/>
+              </w:rPr>
+            </w:r>
+            <w:r>
+              <w:rPr>
+                <w:rFonts w:ascii="Arial" w:hAnsi="Arial"/>
+                <w:b/>
+                <w:color w:val="FFFFFF"/>
+                <w:sz w:val="19"/>
+              </w:rPr>
+              <w:t>Learner Name</w:t>
             </w:r>
           </w:p>
         </w:tc>
@@ -256,11 +381,25 @@
           <w:tcPr>
             <w:tcW w:type="dxa" w:w="5184"/>
             <w:vAlign w:val="center"/>
-            <w:shd w:fill="1F6B2A"/>
+            <w:shd w:fill="000000"/>
           </w:tcPr>
           <w:p>
             <w:r>
-              <w:t>Observed evidence / prepared evidence</w:t>
+              <w:rPr>
+                <w:rFonts w:ascii="Arial" w:hAnsi="Arial"/>
+                <w:b/>
+                <w:color w:val="FFFFFF"/>
+                <w:sz w:val="19"/>
+              </w:rPr>
+            </w:r>
+            <w:r>
+              <w:rPr>
+                <w:rFonts w:ascii="Arial" w:hAnsi="Arial"/>
+                <w:b/>
+                <w:color w:val="FFFFFF"/>
+                <w:sz w:val="19"/>
+              </w:rPr>
+              <w:t>Rob Johnston</w:t>
             </w:r>
           </w:p>
         </w:tc>
@@ -270,11 +409,22 @@
           <w:tcPr>
             <w:tcW w:type="dxa" w:w="5184"/>
             <w:vAlign w:val="center"/>
-            <w:shd w:fill="F3FFF1"/>
+            <w:shd w:fill="EEF7EC"/>
           </w:tcPr>
           <w:p>
             <w:r>
-              <w:t>3.1</w:t>
+              <w:rPr>
+                <w:rFonts w:ascii="Arial" w:hAnsi="Arial"/>
+                <w:sz w:val="19"/>
+              </w:rPr>
+            </w:r>
+            <w:r>
+              <w:rPr>
+                <w:rFonts w:ascii="Arial" w:hAnsi="Arial"/>
+                <w:b w:val="0"/>
+                <w:sz w:val="19"/>
+              </w:rPr>
+              <w:t>Unit Name</w:t>
             </w:r>
           </w:p>
         </w:tc>
@@ -282,11 +432,22 @@
           <w:tcPr>
             <w:tcW w:type="dxa" w:w="5184"/>
             <w:vAlign w:val="center"/>
-            <w:shd w:fill="F3FFF1"/>
+            <w:shd w:fill="EEF7EC"/>
           </w:tcPr>
           <w:p>
             <w:r>
-              <w:t>Evidence demonstrates two ways to train a deep learning model using the Iris dataset: a baseline neural network route and a tuned neural network route.</w:t>
+              <w:rPr>
+                <w:rFonts w:ascii="Arial" w:hAnsi="Arial"/>
+                <w:sz w:val="19"/>
+              </w:rPr>
+            </w:r>
+            <w:r>
+              <w:rPr>
+                <w:rFonts w:ascii="Arial" w:hAnsi="Arial"/>
+                <w:b w:val="0"/>
+                <w:sz w:val="19"/>
+              </w:rPr>
+              <w:t>Unit 4 - Deep Learning</w:t>
             </w:r>
           </w:p>
         </w:tc>
@@ -296,10 +457,22 @@
           <w:tcPr>
             <w:tcW w:type="dxa" w:w="5184"/>
             <w:vAlign w:val="center"/>
+            <w:shd w:fill="EEF7EC"/>
           </w:tcPr>
           <w:p>
             <w:r>
-              <w:t>3.2</w:t>
+              <w:rPr>
+                <w:rFonts w:ascii="Arial" w:hAnsi="Arial"/>
+                <w:sz w:val="19"/>
+              </w:rPr>
+            </w:r>
+            <w:r>
+              <w:rPr>
+                <w:rFonts w:ascii="Arial" w:hAnsi="Arial"/>
+                <w:b w:val="0"/>
+                <w:sz w:val="19"/>
+              </w:rPr>
+              <w:t>Assessment Name</w:t>
             </w:r>
           </w:p>
         </w:tc>
@@ -307,10 +480,22 @@
           <w:tcPr>
             <w:tcW w:type="dxa" w:w="5184"/>
             <w:vAlign w:val="center"/>
+            <w:shd w:fill="EEF7EC"/>
           </w:tcPr>
           <w:p>
             <w:r>
-              <w:t>Evidence demonstrates validation-set hyperparameter tuning by comparing hidden-size and learning-rate settings using validation loss.</w:t>
+              <w:rPr>
+                <w:rFonts w:ascii="Arial" w:hAnsi="Arial"/>
+                <w:sz w:val="19"/>
+              </w:rPr>
+            </w:r>
+            <w:r>
+              <w:rPr>
+                <w:rFonts w:ascii="Arial" w:hAnsi="Arial"/>
+                <w:b w:val="0"/>
+                <w:sz w:val="19"/>
+              </w:rPr>
+              <w:t>Lesson 5 - Deep Learning Training Project</w:t>
             </w:r>
           </w:p>
         </w:tc>
@@ -320,11 +505,22 @@
           <w:tcPr>
             <w:tcW w:type="dxa" w:w="5184"/>
             <w:vAlign w:val="center"/>
-            <w:shd w:fill="F3FFF1"/>
+            <w:shd w:fill="EEF7EC"/>
           </w:tcPr>
           <w:p>
             <w:r>
-              <w:t>3.3</w:t>
+              <w:rPr>
+                <w:rFonts w:ascii="Arial" w:hAnsi="Arial"/>
+                <w:sz w:val="19"/>
+              </w:rPr>
+            </w:r>
+            <w:r>
+              <w:rPr>
+                <w:rFonts w:ascii="Arial" w:hAnsi="Arial"/>
+                <w:b w:val="0"/>
+                <w:sz w:val="19"/>
+              </w:rPr>
+              <w:t>Tutor/Assessor Name</w:t>
             </w:r>
           </w:p>
         </w:tc>
@@ -332,11 +528,22 @@
           <w:tcPr>
             <w:tcW w:type="dxa" w:w="5184"/>
             <w:vAlign w:val="center"/>
-            <w:shd w:fill="F3FFF1"/>
+            <w:shd w:fill="EEF7EC"/>
           </w:tcPr>
           <w:p>
             <w:r>
-              <w:t>Evidence demonstrates inference by passing a held-back Iris sample through the selected trained model and recording the predicted class probabilities.</w:t>
+              <w:rPr>
+                <w:rFonts w:ascii="Arial" w:hAnsi="Arial"/>
+                <w:sz w:val="19"/>
+              </w:rPr>
+            </w:r>
+            <w:r>
+              <w:rPr>
+                <w:rFonts w:ascii="Arial" w:hAnsi="Arial"/>
+                <w:b w:val="0"/>
+                <w:sz w:val="19"/>
+              </w:rPr>
+              <w:t>Mohammad Ali Afgan</w:t>
             </w:r>
           </w:p>
         </w:tc>
@@ -346,18 +553,46 @@
           <w:tcPr>
             <w:tcW w:type="dxa" w:w="5184"/>
             <w:vAlign w:val="center"/>
+            <w:shd w:fill="EEF7EC"/>
           </w:tcPr>
           <w:p>
-            <w:r/>
+            <w:r>
+              <w:rPr>
+                <w:rFonts w:ascii="Arial" w:hAnsi="Arial"/>
+                <w:sz w:val="19"/>
+              </w:rPr>
+            </w:r>
+            <w:r>
+              <w:rPr>
+                <w:rFonts w:ascii="Arial" w:hAnsi="Arial"/>
+                <w:b w:val="0"/>
+                <w:sz w:val="19"/>
+              </w:rPr>
+              <w:t>Date</w:t>
+            </w:r>
           </w:p>
         </w:tc>
         <w:tc>
           <w:tcPr>
             <w:tcW w:type="dxa" w:w="5184"/>
             <w:vAlign w:val="center"/>
+            <w:shd w:fill="EEF7EC"/>
           </w:tcPr>
           <w:p>
-            <w:r/>
+            <w:r>
+              <w:rPr>
+                <w:rFonts w:ascii="Arial" w:hAnsi="Arial"/>
+                <w:sz w:val="19"/>
+              </w:rPr>
+            </w:r>
+            <w:r>
+              <w:rPr>
+                <w:rFonts w:ascii="Arial" w:hAnsi="Arial"/>
+                <w:b w:val="0"/>
+                <w:sz w:val="19"/>
+              </w:rPr>
+              <w:t>2 July 2026</w:t>
+            </w:r>
           </w:p>
         </w:tc>
       </w:tr>
@@ -366,20 +601,46 @@
           <w:tcPr>
             <w:tcW w:type="dxa" w:w="5184"/>
             <w:vAlign w:val="center"/>
-            <w:shd w:fill="F3FFF1"/>
+            <w:shd w:fill="EEF7EC"/>
           </w:tcPr>
           <w:p>
-            <w:r/>
+            <w:r>
+              <w:rPr>
+                <w:rFonts w:ascii="Arial" w:hAnsi="Arial"/>
+                <w:sz w:val="19"/>
+              </w:rPr>
+            </w:r>
+            <w:r>
+              <w:rPr>
+                <w:rFonts w:ascii="Arial" w:hAnsi="Arial"/>
+                <w:b w:val="0"/>
+                <w:sz w:val="19"/>
+              </w:rPr>
+              <w:t>Evidence Type</w:t>
+            </w:r>
           </w:p>
         </w:tc>
         <w:tc>
           <w:tcPr>
             <w:tcW w:type="dxa" w:w="5184"/>
             <w:vAlign w:val="center"/>
-            <w:shd w:fill="F3FFF1"/>
+            <w:shd w:fill="EEF7EC"/>
           </w:tcPr>
           <w:p>
-            <w:r/>
+            <w:r>
+              <w:rPr>
+                <w:rFonts w:ascii="Arial" w:hAnsi="Arial"/>
+                <w:sz w:val="19"/>
+              </w:rPr>
+            </w:r>
+            <w:r>
+              <w:rPr>
+                <w:rFonts w:ascii="Arial" w:hAnsi="Arial"/>
+                <w:b w:val="0"/>
+                <w:sz w:val="19"/>
+              </w:rPr>
+              <w:t>TQUK Observation Record supporting project evidence</w:t>
+            </w:r>
           </w:p>
         </w:tc>
       </w:tr>
@@ -388,90 +649,389 @@
           <w:tcPr>
             <w:tcW w:type="dxa" w:w="5184"/>
             <w:vAlign w:val="center"/>
+            <w:shd w:fill="EEF7EC"/>
           </w:tcPr>
           <w:p>
-            <w:r/>
+            <w:r>
+              <w:rPr>
+                <w:rFonts w:ascii="Arial" w:hAnsi="Arial"/>
+                <w:sz w:val="19"/>
+              </w:rPr>
+            </w:r>
+            <w:r>
+              <w:rPr>
+                <w:rFonts w:ascii="Arial" w:hAnsi="Arial"/>
+                <w:b w:val="0"/>
+                <w:sz w:val="19"/>
+              </w:rPr>
+              <w:t>Criteria Covered</w:t>
+            </w:r>
           </w:p>
         </w:tc>
         <w:tc>
           <w:tcPr>
             <w:tcW w:type="dxa" w:w="5184"/>
             <w:vAlign w:val="center"/>
+            <w:shd w:fill="EEF7EC"/>
           </w:tcPr>
           <w:p>
-            <w:r/>
+            <w:r>
+              <w:rPr>
+                <w:rFonts w:ascii="Arial" w:hAnsi="Arial"/>
+                <w:sz w:val="19"/>
+              </w:rPr>
+            </w:r>
+            <w:r>
+              <w:rPr>
+                <w:rFonts w:ascii="Arial" w:hAnsi="Arial"/>
+                <w:b w:val="0"/>
+                <w:sz w:val="19"/>
+              </w:rPr>
+              <w:t>3.1, 3.2 and 3.3</w:t>
+            </w:r>
+          </w:p>
+        </w:tc>
+      </w:tr>
+    </w:tbl>
+    <w:p>
+      <w:r>
+        <w:br w:type="page"/>
+      </w:r>
+    </w:p>
+    <w:p>
+      <w:pPr>
+        <w:jc w:val="center"/>
+      </w:pPr>
+      <w:r>
+        <w:rPr>
+          <w:rFonts w:ascii="Arial" w:hAnsi="Arial"/>
+          <w:b/>
+          <w:color w:val="00723A"/>
+          <w:sz w:val="36"/>
+        </w:rPr>
+        <w:t>TQUK Observation Record</w:t>
+      </w:r>
+    </w:p>
+    <w:tbl>
+      <w:tblPr>
+        <w:tblW w:type="auto" w:w="0"/>
+        <w:jc w:val="center"/>
+        <w:tblLook w:firstColumn="1" w:firstRow="1" w:lastColumn="0" w:lastRow="0" w:noHBand="0" w:noVBand="1" w:val="04A0"/>
+      </w:tblPr>
+      <w:tblGrid>
+        <w:gridCol w:w="3456"/>
+        <w:gridCol w:w="3456"/>
+        <w:gridCol w:w="3456"/>
+      </w:tblGrid>
+      <w:tr>
+        <w:tc>
+          <w:tcPr>
+            <w:tcW w:type="dxa" w:w="3456"/>
+            <w:vAlign w:val="center"/>
+            <w:shd w:fill="000000"/>
+          </w:tcPr>
+          <w:p>
+            <w:r>
+              <w:rPr>
+                <w:rFonts w:ascii="Arial" w:hAnsi="Arial"/>
+                <w:b/>
+                <w:color w:val="FFFFFF"/>
+                <w:sz w:val="19"/>
+              </w:rPr>
+            </w:r>
+            <w:r>
+              <w:rPr>
+                <w:rFonts w:ascii="Arial" w:hAnsi="Arial"/>
+                <w:b/>
+                <w:color w:val="FFFFFF"/>
+                <w:sz w:val="19"/>
+              </w:rPr>
+              <w:t>Criterion</w:t>
+            </w:r>
+          </w:p>
+        </w:tc>
+        <w:tc>
+          <w:tcPr>
+            <w:tcW w:type="dxa" w:w="3456"/>
+            <w:vAlign w:val="center"/>
+            <w:shd w:fill="000000"/>
+          </w:tcPr>
+          <w:p>
+            <w:r>
+              <w:rPr>
+                <w:rFonts w:ascii="Arial" w:hAnsi="Arial"/>
+                <w:b/>
+                <w:color w:val="FFFFFF"/>
+                <w:sz w:val="19"/>
+              </w:rPr>
+            </w:r>
+            <w:r>
+              <w:rPr>
+                <w:rFonts w:ascii="Arial" w:hAnsi="Arial"/>
+                <w:b/>
+                <w:color w:val="FFFFFF"/>
+                <w:sz w:val="19"/>
+              </w:rPr>
+              <w:t>Observed / prepared evidence</w:t>
+            </w:r>
+          </w:p>
+        </w:tc>
+        <w:tc>
+          <w:tcPr>
+            <w:tcW w:type="dxa" w:w="3456"/>
+            <w:vAlign w:val="center"/>
+            <w:shd w:fill="000000"/>
+          </w:tcPr>
+          <w:p>
+            <w:r>
+              <w:rPr>
+                <w:rFonts w:ascii="Arial" w:hAnsi="Arial"/>
+                <w:b/>
+                <w:color w:val="FFFFFF"/>
+                <w:sz w:val="19"/>
+              </w:rPr>
+            </w:r>
+            <w:r>
+              <w:rPr>
+                <w:rFonts w:ascii="Arial" w:hAnsi="Arial"/>
+                <w:b/>
+                <w:color w:val="FFFFFF"/>
+                <w:sz w:val="19"/>
+              </w:rPr>
+              <w:t>Status</w:t>
+            </w:r>
           </w:p>
         </w:tc>
       </w:tr>
       <w:tr>
         <w:tc>
           <w:tcPr>
-            <w:tcW w:type="dxa" w:w="5184"/>
+            <w:tcW w:type="dxa" w:w="3456"/>
             <w:vAlign w:val="center"/>
-            <w:shd w:fill="F3FFF1"/>
+            <w:shd w:fill="EEF7EC"/>
           </w:tcPr>
           <w:p>
-            <w:r/>
+            <w:r>
+              <w:rPr>
+                <w:rFonts w:ascii="Arial" w:hAnsi="Arial"/>
+                <w:sz w:val="19"/>
+              </w:rPr>
+            </w:r>
+            <w:r>
+              <w:rPr>
+                <w:rFonts w:ascii="Arial" w:hAnsi="Arial"/>
+                <w:b w:val="0"/>
+                <w:sz w:val="19"/>
+              </w:rPr>
+              <w:t>3.1</w:t>
+            </w:r>
           </w:p>
         </w:tc>
         <w:tc>
           <w:tcPr>
-            <w:tcW w:type="dxa" w:w="5184"/>
+            <w:tcW w:type="dxa" w:w="3456"/>
             <w:vAlign w:val="center"/>
-            <w:shd w:fill="F3FFF1"/>
+            <w:shd w:fill="EEF7EC"/>
           </w:tcPr>
           <w:p>
-            <w:r/>
+            <w:r>
+              <w:t>Two training routes are shown: a baseline Iris neural network and a validation-tuned Iris neural network.</w:t>
+            </w:r>
+          </w:p>
+        </w:tc>
+        <w:tc>
+          <w:tcPr>
+            <w:tcW w:type="dxa" w:w="3456"/>
+            <w:vAlign w:val="center"/>
+            <w:shd w:fill="EEF7EC"/>
+          </w:tcPr>
+          <w:p>
+            <w:r>
+              <w:rPr>
+                <w:rFonts w:ascii="Arial" w:hAnsi="Arial"/>
+                <w:sz w:val="19"/>
+              </w:rPr>
+            </w:r>
+            <w:r>
+              <w:rPr>
+                <w:rFonts w:ascii="Arial" w:hAnsi="Arial"/>
+                <w:b w:val="0"/>
+                <w:sz w:val="19"/>
+              </w:rPr>
+              <w:t>Prepared</w:t>
+            </w:r>
           </w:p>
         </w:tc>
       </w:tr>
       <w:tr>
         <w:tc>
           <w:tcPr>
-            <w:tcW w:type="dxa" w:w="5184"/>
+            <w:tcW w:type="dxa" w:w="3456"/>
             <w:vAlign w:val="center"/>
+            <w:shd w:fill="EEF7EC"/>
           </w:tcPr>
           <w:p>
-            <w:r/>
+            <w:r>
+              <w:rPr>
+                <w:rFonts w:ascii="Arial" w:hAnsi="Arial"/>
+                <w:sz w:val="19"/>
+              </w:rPr>
+            </w:r>
+            <w:r>
+              <w:rPr>
+                <w:rFonts w:ascii="Arial" w:hAnsi="Arial"/>
+                <w:b w:val="0"/>
+                <w:sz w:val="19"/>
+              </w:rPr>
+              <w:t>3.2</w:t>
+            </w:r>
           </w:p>
         </w:tc>
         <w:tc>
           <w:tcPr>
-            <w:tcW w:type="dxa" w:w="5184"/>
+            <w:tcW w:type="dxa" w:w="3456"/>
             <w:vAlign w:val="center"/>
+            <w:shd w:fill="EEF7EC"/>
           </w:tcPr>
           <w:p>
-            <w:r/>
+            <w:r>
+              <w:t>Validation loss is used to compare hidden-size and learning-rate settings before the final test check.</w:t>
+            </w:r>
+          </w:p>
+        </w:tc>
+        <w:tc>
+          <w:tcPr>
+            <w:tcW w:type="dxa" w:w="3456"/>
+            <w:vAlign w:val="center"/>
+            <w:shd w:fill="EEF7EC"/>
+          </w:tcPr>
+          <w:p>
+            <w:r>
+              <w:rPr>
+                <w:rFonts w:ascii="Arial" w:hAnsi="Arial"/>
+                <w:sz w:val="19"/>
+              </w:rPr>
+            </w:r>
+            <w:r>
+              <w:rPr>
+                <w:rFonts w:ascii="Arial" w:hAnsi="Arial"/>
+                <w:b w:val="0"/>
+                <w:sz w:val="19"/>
+              </w:rPr>
+              <w:t>Prepared</w:t>
+            </w:r>
+          </w:p>
+        </w:tc>
+      </w:tr>
+      <w:tr>
+        <w:tc>
+          <w:tcPr>
+            <w:tcW w:type="dxa" w:w="3456"/>
+            <w:vAlign w:val="center"/>
+            <w:shd w:fill="EEF7EC"/>
+          </w:tcPr>
+          <w:p>
+            <w:r>
+              <w:rPr>
+                <w:rFonts w:ascii="Arial" w:hAnsi="Arial"/>
+                <w:sz w:val="19"/>
+              </w:rPr>
+            </w:r>
+            <w:r>
+              <w:rPr>
+                <w:rFonts w:ascii="Arial" w:hAnsi="Arial"/>
+                <w:b w:val="0"/>
+                <w:sz w:val="19"/>
+              </w:rPr>
+              <w:t>3.3</w:t>
+            </w:r>
+          </w:p>
+        </w:tc>
+        <w:tc>
+          <w:tcPr>
+            <w:tcW w:type="dxa" w:w="3456"/>
+            <w:vAlign w:val="center"/>
+            <w:shd w:fill="EEF7EC"/>
+          </w:tcPr>
+          <w:p>
+            <w:r>
+              <w:t>A held-back Iris flower sample is passed through the selected network and class probabilities are recorded.</w:t>
+            </w:r>
+          </w:p>
+        </w:tc>
+        <w:tc>
+          <w:tcPr>
+            <w:tcW w:type="dxa" w:w="3456"/>
+            <w:vAlign w:val="center"/>
+            <w:shd w:fill="EEF7EC"/>
+          </w:tcPr>
+          <w:p>
+            <w:r>
+              <w:rPr>
+                <w:rFonts w:ascii="Arial" w:hAnsi="Arial"/>
+                <w:sz w:val="19"/>
+              </w:rPr>
+            </w:r>
+            <w:r>
+              <w:rPr>
+                <w:rFonts w:ascii="Arial" w:hAnsi="Arial"/>
+                <w:b w:val="0"/>
+                <w:sz w:val="19"/>
+              </w:rPr>
+              <w:t>Prepared</w:t>
+            </w:r>
           </w:p>
         </w:tc>
       </w:tr>
     </w:tbl>
-    <w:p/>
     <w:p>
       <w:pPr>
-        <w:spacing w:after="120"/>
+        <w:jc w:val="left"/>
       </w:pPr>
       <w:r>
         <w:rPr>
           <w:rFonts w:ascii="Arial" w:hAnsi="Arial"/>
           <w:b/>
-          <w:color w:val="26802D"/>
-          <w:sz w:val="26"/>
+          <w:color w:val="00723A"/>
+          <w:sz w:val="28"/>
+        </w:rPr>
+        <w:t>Evidence Route</w:t>
+      </w:r>
+    </w:p>
+    <w:p>
+      <w:r>
+        <w:rPr>
+          <w:rFonts w:ascii="Arial" w:hAnsi="Arial"/>
+          <w:sz w:val="20"/>
+        </w:rPr>
+        <w:t>The prepared evidence route is the SS Evidence Collection document with embedded screenshots and annotations, the written answer sheet, the project notebook, the Kaggle notebook copy, two Python source files and the video walkthrough. The loose screenshot images are already embedded in the SS Evidence Collection and are not separate upload files.</w:t>
+      </w:r>
+    </w:p>
+    <w:p>
+      <w:pPr>
+        <w:jc w:val="left"/>
+      </w:pPr>
+      <w:r>
+        <w:rPr>
+          <w:rFonts w:ascii="Arial" w:hAnsi="Arial"/>
+          <w:b/>
+          <w:color w:val="00723A"/>
+          <w:sz w:val="28"/>
         </w:rPr>
         <w:t>Overall Summative Feedback</w:t>
       </w:r>
     </w:p>
     <w:p>
-      <w:pPr>
-        <w:spacing w:after="120"/>
-      </w:pPr>
       <w:r>
-        <w:t>The prepared evidence demonstrates model training, validation tuning and inference through the answer sheet, SS Evidence Collection, project notebook, Kaggle notebook, two Iris Python source files and video walkthrough. The live Kaggle notebook is available at https://www.kaggle.com/code/ogwebsite/unit-4-assessment-5-deep-learning-project.</w:t>
+        <w:rPr>
+          <w:rFonts w:ascii="Arial" w:hAnsi="Arial"/>
+          <w:sz w:val="20"/>
+        </w:rPr>
+        <w:t>The prepared evidence demonstrates model training, validation-set hyperparameter tuning and inference through the Iris dataset task. The evidence is structured in the OG Web.site branded pack format and supports the Lesson 5 criteria 3.1, 3.2 and 3.3.</w:t>
       </w:r>
     </w:p>
     <w:tbl>
       <w:tblPr>
-        <w:tblStyle w:val="TableGrid"/>
         <w:tblW w:type="auto" w:w="0"/>
         <w:jc w:val="center"/>
         <w:tblLook w:firstColumn="1" w:firstRow="1" w:lastColumn="0" w:lastRow="0" w:noHBand="0" w:noVBand="1" w:val="04A0"/>
@@ -485,10 +1045,24 @@
           <w:tcPr>
             <w:tcW w:type="dxa" w:w="5184"/>
             <w:vAlign w:val="center"/>
-            <w:shd w:fill="1F6B2A"/>
+            <w:shd w:fill="000000"/>
           </w:tcPr>
           <w:p>
             <w:r>
+              <w:rPr>
+                <w:rFonts w:ascii="Arial" w:hAnsi="Arial"/>
+                <w:b/>
+                <w:color w:val="FFFFFF"/>
+                <w:sz w:val="19"/>
+              </w:rPr>
+            </w:r>
+            <w:r>
+              <w:rPr>
+                <w:rFonts w:ascii="Arial" w:hAnsi="Arial"/>
+                <w:b/>
+                <w:color w:val="FFFFFF"/>
+                <w:sz w:val="19"/>
+              </w:rPr>
               <w:t>Sign-off field</w:t>
             </w:r>
           </w:p>
@@ -497,10 +1071,24 @@
           <w:tcPr>
             <w:tcW w:type="dxa" w:w="5184"/>
             <w:vAlign w:val="center"/>
-            <w:shd w:fill="1F6B2A"/>
+            <w:shd w:fill="000000"/>
           </w:tcPr>
           <w:p>
             <w:r>
+              <w:rPr>
+                <w:rFonts w:ascii="Arial" w:hAnsi="Arial"/>
+                <w:b/>
+                <w:color w:val="FFFFFF"/>
+                <w:sz w:val="19"/>
+              </w:rPr>
+            </w:r>
+            <w:r>
+              <w:rPr>
+                <w:rFonts w:ascii="Arial" w:hAnsi="Arial"/>
+                <w:b/>
+                <w:color w:val="FFFFFF"/>
+                <w:sz w:val="19"/>
+              </w:rPr>
               <w:t>Entry</w:t>
             </w:r>
           </w:p>
@@ -511,10 +1099,21 @@
           <w:tcPr>
             <w:tcW w:type="dxa" w:w="5184"/>
             <w:vAlign w:val="center"/>
-            <w:shd w:fill="F3FFF1"/>
+            <w:shd w:fill="EEF7EC"/>
           </w:tcPr>
           <w:p>
             <w:r>
+              <w:rPr>
+                <w:rFonts w:ascii="Arial" w:hAnsi="Arial"/>
+                <w:sz w:val="19"/>
+              </w:rPr>
+            </w:r>
+            <w:r>
+              <w:rPr>
+                <w:rFonts w:ascii="Arial" w:hAnsi="Arial"/>
+                <w:b w:val="0"/>
+                <w:sz w:val="19"/>
+              </w:rPr>
               <w:t>Learner name</w:t>
             </w:r>
           </w:p>
@@ -523,10 +1122,21 @@
           <w:tcPr>
             <w:tcW w:type="dxa" w:w="5184"/>
             <w:vAlign w:val="center"/>
-            <w:shd w:fill="F3FFF1"/>
+            <w:shd w:fill="EEF7EC"/>
           </w:tcPr>
           <w:p>
             <w:r>
+              <w:rPr>
+                <w:rFonts w:ascii="Arial" w:hAnsi="Arial"/>
+                <w:sz w:val="19"/>
+              </w:rPr>
+            </w:r>
+            <w:r>
+              <w:rPr>
+                <w:rFonts w:ascii="Arial" w:hAnsi="Arial"/>
+                <w:b w:val="0"/>
+                <w:sz w:val="19"/>
+              </w:rPr>
               <w:t>Rob Johnston</w:t>
             </w:r>
           </w:p>
@@ -537,9 +1147,21 @@
           <w:tcPr>
             <w:tcW w:type="dxa" w:w="5184"/>
             <w:vAlign w:val="center"/>
+            <w:shd w:fill="EEF7EC"/>
           </w:tcPr>
           <w:p>
             <w:r>
+              <w:rPr>
+                <w:rFonts w:ascii="Arial" w:hAnsi="Arial"/>
+                <w:sz w:val="19"/>
+              </w:rPr>
+            </w:r>
+            <w:r>
+              <w:rPr>
+                <w:rFonts w:ascii="Arial" w:hAnsi="Arial"/>
+                <w:b w:val="0"/>
+                <w:sz w:val="19"/>
+              </w:rPr>
               <w:t>Learner signature</w:t>
             </w:r>
           </w:p>
@@ -548,9 +1170,22 @@
           <w:tcPr>
             <w:tcW w:type="dxa" w:w="5184"/>
             <w:vAlign w:val="center"/>
+            <w:shd w:fill="EEF7EC"/>
           </w:tcPr>
           <w:p>
-            <w:r/>
+            <w:r>
+              <w:rPr>
+                <w:rFonts w:ascii="Arial" w:hAnsi="Arial"/>
+                <w:sz w:val="19"/>
+              </w:rPr>
+            </w:r>
+            <w:r>
+              <w:rPr>
+                <w:rFonts w:ascii="Arial" w:hAnsi="Arial"/>
+                <w:b w:val="0"/>
+                <w:sz w:val="19"/>
+              </w:rPr>
+            </w:r>
           </w:p>
         </w:tc>
       </w:tr>
@@ -559,11 +1194,22 @@
           <w:tcPr>
             <w:tcW w:type="dxa" w:w="5184"/>
             <w:vAlign w:val="center"/>
-            <w:shd w:fill="F3FFF1"/>
+            <w:shd w:fill="EEF7EC"/>
           </w:tcPr>
           <w:p>
             <w:r>
-              <w:t>Assessor name</w:t>
+              <w:rPr>
+                <w:rFonts w:ascii="Arial" w:hAnsi="Arial"/>
+                <w:sz w:val="19"/>
+              </w:rPr>
+            </w:r>
+            <w:r>
+              <w:rPr>
+                <w:rFonts w:ascii="Arial" w:hAnsi="Arial"/>
+                <w:b w:val="0"/>
+                <w:sz w:val="19"/>
+              </w:rPr>
+              <w:t>Tutor/assessor signature</w:t>
             </w:r>
           </w:p>
         </w:tc>
@@ -571,66 +1217,31 @@
           <w:tcPr>
             <w:tcW w:type="dxa" w:w="5184"/>
             <w:vAlign w:val="center"/>
-            <w:shd w:fill="F3FFF1"/>
-          </w:tcPr>
-          <w:p>
-            <w:r/>
-          </w:p>
-        </w:tc>
-      </w:tr>
-      <w:tr>
-        <w:tc>
-          <w:tcPr>
-            <w:tcW w:type="dxa" w:w="5184"/>
-            <w:vAlign w:val="center"/>
+            <w:shd w:fill="EEF7EC"/>
           </w:tcPr>
           <w:p>
             <w:r>
-              <w:t>Assessor signature</w:t>
+              <w:rPr>
+                <w:rFonts w:ascii="Arial" w:hAnsi="Arial"/>
+                <w:sz w:val="19"/>
+              </w:rPr>
             </w:r>
-          </w:p>
-        </w:tc>
-        <w:tc>
-          <w:tcPr>
-            <w:tcW w:type="dxa" w:w="5184"/>
-            <w:vAlign w:val="center"/>
-          </w:tcPr>
-          <w:p>
-            <w:r/>
-          </w:p>
-        </w:tc>
-      </w:tr>
-      <w:tr>
-        <w:tc>
-          <w:tcPr>
-            <w:tcW w:type="dxa" w:w="5184"/>
-            <w:vAlign w:val="center"/>
-            <w:shd w:fill="F3FFF1"/>
-          </w:tcPr>
-          <w:p>
             <w:r>
-              <w:t>Date</w:t>
+              <w:rPr>
+                <w:rFonts w:ascii="Arial" w:hAnsi="Arial"/>
+                <w:b w:val="0"/>
+                <w:sz w:val="19"/>
+              </w:rPr>
             </w:r>
-          </w:p>
-        </w:tc>
-        <w:tc>
-          <w:tcPr>
-            <w:tcW w:type="dxa" w:w="5184"/>
-            <w:vAlign w:val="center"/>
-            <w:shd w:fill="F3FFF1"/>
-          </w:tcPr>
-          <w:p>
-            <w:r/>
           </w:p>
         </w:tc>
       </w:tr>
     </w:tbl>
-    <w:p/>
     <w:sectPr>
       <w:headerReference w:type="default" r:id="rId9"/>
       <w:footerReference w:type="default" r:id="rId10"/>
       <w:pgSz w:w="12240" w:h="15840"/>
-      <w:pgMar w:top="792" w:right="936" w:bottom="792" w:left="936" w:header="720" w:footer="720" w:gutter="0"/>
+      <w:pgMar w:top="893" w:right="936" w:bottom="792" w:left="936" w:header="720" w:footer="720" w:gutter="0"/>
       <w:cols w:space="720"/>
       <w:docGrid w:linePitch="360"/>
     </w:sectPr>
@@ -648,10 +1259,9 @@
     <w:r>
       <w:rPr>
         <w:rFonts w:ascii="Arial" w:hAnsi="Arial"/>
-        <w:color w:val="505050"/>
         <w:sz w:val="16"/>
       </w:rPr>
-      <w:t xml:space="preserve">TQUK Observation Record | Page </w:t>
+      <w:t>OG Web.site | www.og-web.site | OG-Website GitHub</w:t>
     </w:r>
   </w:p>
 </w:ftr>
@@ -662,13 +1272,12 @@
   <w:p>
     <w:pPr>
       <w:pStyle w:val="Header"/>
-      <w:jc w:val="left"/>
     </w:pPr>
     <w:r/>
     <w:r>
       <w:drawing>
         <wp:inline xmlns:a="http://schemas.openxmlformats.org/drawingml/2006/main" xmlns:pic="http://schemas.openxmlformats.org/drawingml/2006/picture">
-          <wp:extent cx="1143000" cy="554988"/>
+          <wp:extent cx="1170432" cy="568308"/>
           <wp:docPr id="1" name="Picture 1"/>
           <wp:cNvGraphicFramePr>
             <a:graphicFrameLocks noChangeAspect="1"/>
@@ -677,7 +1286,7 @@
             <a:graphicData uri="http://schemas.openxmlformats.org/drawingml/2006/picture">
               <pic:pic>
                 <pic:nvPicPr>
-                  <pic:cNvPr id="0" name="image.png"/>
+                  <pic:cNvPr id="0" name="og_header.png"/>
                   <pic:cNvPicPr/>
                 </pic:nvPicPr>
                 <pic:blipFill>
@@ -689,7 +1298,7 @@
                 <pic:spPr>
                   <a:xfrm>
                     <a:off x="0" y="0"/>
-                    <a:ext cx="1143000" cy="554988"/>
+                    <a:ext cx="1170432" cy="568308"/>
                   </a:xfrm>
                   <a:prstGeom prst="rect"/>
                 </pic:spPr>
@@ -699,12 +1308,18 @@
         </wp:inline>
       </w:drawing>
     </w:r>
+  </w:p>
+  <w:p>
+    <w:pPr>
+      <w:jc w:val="right"/>
+    </w:pPr>
     <w:r>
       <w:rPr>
-        <w:b/>
-        <w:color w:val="06763D"/>
-      </w:rPr>
-      <w:t xml:space="preserve">   Unit 4 Assessment 5 - TQUK Observation Record</w:t>
+        <w:rFonts w:ascii="Arial" w:hAnsi="Arial"/>
+        <w:b/>
+        <w:sz w:val="16"/>
+      </w:rPr>
+      <w:t>AI PROGRAMMING / GITHUB EVIDENCE PACK</w:t>
     </w:r>
   </w:p>
 </w:hdr>

</xml_diff>